<commit_message>
Fondos con más capas en cada ala, ejecutable actualizado y notas para explicar el juego
</commit_message>
<xml_diff>
--- a/Documentacion/Producto3/PérezAlcántaraAlejandro_Postmortem_10D.docx
+++ b/Documentacion/Producto3/PérezAlcántaraAlejandro_Postmortem_10D.docx
@@ -290,7 +290,7 @@
                 <w:i w:val="0"/>
                 <w:sz w:val="20"/>
               </w:rPr>
-              <w:t>20 de octubre de 2026</w:t>
+              <w:t>21 de octubre de 2026</w:t>
             </w:r>
           </w:p>
         </w:tc>
@@ -606,7 +606,7 @@
                 <w:i w:val="0"/>
                 <w:sz w:val="20"/>
               </w:rPr>
-              <w:t>27 en el Feature Log; 24 terminados al 20 de octubre</w:t>
+              <w:t>27 en el Feature Log; 24 terminados al 21 de octubre</w:t>
             </w:r>
           </w:p>
         </w:tc>
@@ -646,7 +646,7 @@
                 <w:i w:val="0"/>
                 <w:sz w:val="20"/>
               </w:rPr>
-              <w:t>46 tareas (43 terminadas) y 187 horas estimadas (178 terminadas)</w:t>
+              <w:t>48 tareas (45 terminadas) y 192 horas estimadas (183 terminadas)</w:t>
             </w:r>
           </w:p>
         </w:tc>
@@ -909,6 +909,33 @@
           <w:i w:val="0"/>
         </w:rPr>
         <w:t xml:space="preserve"> Juntar todas las entradas en Controles.cs hizo fácil cambiar las teclas cuando vi que jugar en laptop era incómodo.</w:t>
+      </w:r>
+    </w:p>
+    <w:p>
+      <w:pPr>
+        <w:pStyle w:val="ListBullet"/>
+        <w:spacing w:after="60"/>
+        <w:jc w:val="both"/>
+      </w:pPr>
+      <w:r>
+        <w:rPr>
+          <w:b w:val="0"/>
+          <w:i w:val="0"/>
+        </w:rPr>
+      </w:r>
+      <w:r>
+        <w:rPr>
+          <w:b/>
+          <w:i w:val="0"/>
+        </w:rPr>
+        <w:t>Fondos con profundidad.</w:t>
+      </w:r>
+      <w:r>
+        <w:rPr>
+          <w:b w:val="0"/>
+          <w:i w:val="0"/>
+        </w:rPr>
+        <w:t xml:space="preserve"> Con capas de parallax y adornos dibujados por código (niebla, rayos de luz, estandartes, aves, libros flotantes) cada ala se ve más viva sin necesitar arte nuevo.</w:t>
       </w:r>
     </w:p>
     <w:p>

</xml_diff>

<commit_message>
Versión web para celular: controles táctiles, plantilla para instalarla como app y documentos actualizados
</commit_message>
<xml_diff>
--- a/Documentacion/Producto3/PérezAlcántaraAlejandro_Postmortem_10D.docx
+++ b/Documentacion/Producto3/PérezAlcántaraAlejandro_Postmortem_10D.docx
@@ -646,7 +646,7 @@
                 <w:i w:val="0"/>
                 <w:sz w:val="20"/>
               </w:rPr>
-              <w:t>48 tareas (45 terminadas) y 192 horas estimadas (183 terminadas)</w:t>
+              <w:t>49 tareas (46 terminadas) y 198 horas estimadas (189 terminadas)</w:t>
             </w:r>
           </w:p>
         </w:tc>
@@ -963,6 +963,33 @@
           <w:i w:val="0"/>
         </w:rPr>
         <w:t xml:space="preserve"> Los comentarios de la revisión de avance (Lira flotando) y de las pruebas propias (aves, secretos) se convirtieron en tareas concretas y se corrigieron en pocos días.</w:t>
+      </w:r>
+    </w:p>
+    <w:p>
+      <w:pPr>
+        <w:pStyle w:val="ListBullet"/>
+        <w:spacing w:after="60"/>
+        <w:jc w:val="both"/>
+      </w:pPr>
+      <w:r>
+        <w:rPr>
+          <w:b w:val="0"/>
+          <w:i w:val="0"/>
+        </w:rPr>
+      </w:r>
+      <w:r>
+        <w:rPr>
+          <w:b/>
+          <w:i w:val="0"/>
+        </w:rPr>
+        <w:t>Versión para celular.</w:t>
+      </w:r>
+      <w:r>
+        <w:rPr>
+          <w:b w:val="0"/>
+          <w:i w:val="0"/>
+        </w:rPr>
+        <w:t xml:space="preserve"> Como todas las entradas ya pasaban por Controles.cs, agregar botones táctiles y compilar para web no obligó a cambiar el resto del juego. Ahora se juega desde un link de GitHub Pages y se instala como app.</w:t>
       </w:r>
     </w:p>
     <w:p>

</xml_diff>

<commit_message>
Libro de producción completo: portada, Sprint 4 y resumen por sprint
</commit_message>
<xml_diff>
--- a/Documentacion/Producto3/PérezAlcántaraAlejandro_Postmortem_10D.docx
+++ b/Documentacion/Producto3/PérezAlcántaraAlejandro_Postmortem_10D.docx
@@ -486,7 +486,7 @@
                 <w:i w:val="0"/>
                 <w:sz w:val="20"/>
               </w:rPr>
-              <w:t>67 del juego y 4 herramientas de editor</w:t>
+              <w:t>70 del juego y 4 herramientas de editor</w:t>
             </w:r>
           </w:p>
         </w:tc>
@@ -606,7 +606,47 @@
                 <w:i w:val="0"/>
                 <w:sz w:val="20"/>
               </w:rPr>
-              <w:t>27 en el Feature Log; 24 terminados al 21 de octubre</w:t>
+              <w:t>29 en el Feature Log; 26 terminados al 23 de octubre</w:t>
+            </w:r>
+          </w:p>
+        </w:tc>
+      </w:tr>
+      <w:tr>
+        <w:tc>
+          <w:tcPr>
+            <w:tcW w:type="dxa" w:w="2381"/>
+            <w:vAlign w:val="center"/>
+          </w:tcPr>
+          <w:p>
+            <w:pPr>
+              <w:spacing w:after="0" w:line="240" w:lineRule="auto"/>
+            </w:pPr>
+            <w:r>
+              <w:rPr>
+                <w:b w:val="0"/>
+                <w:i w:val="0"/>
+                <w:sz w:val="20"/>
+              </w:rPr>
+              <w:t>Sprint 1</w:t>
+            </w:r>
+          </w:p>
+        </w:tc>
+        <w:tc>
+          <w:tcPr>
+            <w:tcW w:type="dxa" w:w="7200"/>
+            <w:vAlign w:val="center"/>
+          </w:tcPr>
+          <w:p>
+            <w:pPr>
+              <w:spacing w:after="0" w:line="240" w:lineRule="auto"/>
+            </w:pPr>
+            <w:r>
+              <w:rPr>
+                <w:b w:val="0"/>
+                <w:i w:val="0"/>
+                <w:sz w:val="20"/>
+              </w:rPr>
+              <w:t>10 tareas de arte y diseño (todas terminadas), 40 horas</w:t>
             </w:r>
           </w:p>
         </w:tc>
@@ -646,7 +686,7 @@
                 <w:i w:val="0"/>
                 <w:sz w:val="20"/>
               </w:rPr>
-              <w:t>49 tareas (46 terminadas) y 198 horas estimadas (189 terminadas)</w:t>
+              <w:t>51 tareas (48 terminadas) y 203 horas estimadas (194 terminadas)</w:t>
             </w:r>
           </w:p>
         </w:tc>
@@ -767,6 +807,46 @@
                 <w:sz w:val="20"/>
               </w:rPr>
               <w:t>150 MB (63 MB comprimido), Windows 10/11 de 64 bits</w:t>
+            </w:r>
+          </w:p>
+        </w:tc>
+      </w:tr>
+      <w:tr>
+        <w:tc>
+          <w:tcPr>
+            <w:tcW w:type="dxa" w:w="2381"/>
+            <w:vAlign w:val="center"/>
+          </w:tcPr>
+          <w:p>
+            <w:pPr>
+              <w:spacing w:after="0" w:line="240" w:lineRule="auto"/>
+            </w:pPr>
+            <w:r>
+              <w:rPr>
+                <w:b w:val="0"/>
+                <w:i w:val="0"/>
+                <w:sz w:val="20"/>
+              </w:rPr>
+              <w:t>Versión web</w:t>
+            </w:r>
+          </w:p>
+        </w:tc>
+        <w:tc>
+          <w:tcPr>
+            <w:tcW w:type="dxa" w:w="7200"/>
+            <w:vAlign w:val="center"/>
+          </w:tcPr>
+          <w:p>
+            <w:pPr>
+              <w:spacing w:after="0" w:line="240" w:lineRule="auto"/>
+            </w:pPr>
+            <w:r>
+              <w:rPr>
+                <w:b w:val="0"/>
+                <w:i w:val="0"/>
+                <w:sz w:val="20"/>
+              </w:rPr>
+              <w:t>45 MB, se juega en el navegador y en el celular (alexap1115web.github.io/Ecos-Del-Grimorio)</w:t>
             </w:r>
           </w:p>
         </w:tc>

</xml_diff>